<commit_message>
feat: Enhance user and course management with improved validation and error handling, update OpenAPI documentation, and refine test cases
</commit_message>
<xml_diff>
--- a/docs/pruebas/Informe de pruebas unitarias (SP2).docx
+++ b/docs/pruebas/Informe de pruebas unitarias (SP2).docx
@@ -1580,7 +1580,7 @@
                 <w:sz w:val="20"/>
                 <w:szCs w:val="20"/>
               </w:rPr>
-              <w:t xml:space="preserve">10</w:t>
+              <w:t xml:space="preserve">11</w:t>
             </w:r>
           </w:p>
         </w:tc>
@@ -1722,7 +1722,7 @@
                 <w:sz w:val="20"/>
                 <w:szCs w:val="20"/>
               </w:rPr>
-              <w:t xml:space="preserve">5</w:t>
+              <w:t xml:space="preserve">4</w:t>
             </w:r>
           </w:p>
         </w:tc>
@@ -2948,7 +2948,7 @@
                 <w:sz w:val="20"/>
                 <w:szCs w:val="20"/>
               </w:rPr>
-              <w:t xml:space="preserve">46%</w:t>
+              <w:t xml:space="preserve">37%</w:t>
             </w:r>
           </w:p>
         </w:tc>
@@ -2981,7 +2981,7 @@
                 <w:sz w:val="20"/>
                 <w:szCs w:val="20"/>
               </w:rPr>
-              <w:t xml:space="preserve">71%</w:t>
+              <w:t xml:space="preserve">92%</w:t>
             </w:r>
           </w:p>
         </w:tc>
@@ -3014,7 +3014,7 @@
                 <w:sz w:val="20"/>
                 <w:szCs w:val="20"/>
               </w:rPr>
-              <w:t xml:space="preserve">43%</w:t>
+              <w:t xml:space="preserve">36%</w:t>
             </w:r>
           </w:p>
         </w:tc>
@@ -3085,7 +3085,7 @@
                 <w:sz w:val="20"/>
                 <w:szCs w:val="20"/>
               </w:rPr>
-              <w:t xml:space="preserve">35%</w:t>
+              <w:t xml:space="preserve">32%</w:t>
             </w:r>
           </w:p>
         </w:tc>
@@ -3151,7 +3151,7 @@
                 <w:sz w:val="20"/>
                 <w:szCs w:val="20"/>
               </w:rPr>
-              <w:t xml:space="preserve">38%</w:t>
+              <w:t xml:space="preserve">33%</w:t>
             </w:r>
           </w:p>
         </w:tc>
@@ -4835,7 +4835,7 @@
                 <w:sz w:val="20"/>
                 <w:szCs w:val="20"/>
               </w:rPr>
-              <w:t xml:space="preserve">Pendiente</w:t>
+              <w:t xml:space="preserve">Aprobada</w:t>
             </w:r>
           </w:p>
         </w:tc>
@@ -5385,25 +5385,6 @@
           <w:szCs w:val="21"/>
         </w:rPr>
         <w:t xml:space="preserve">S2-14: posible bug: services/userService.js:89 no comprueba si el correo existe; la restricción UNIQUE de la base lo frena pero controllers/userController.js:21 lo devuelve como 500 con el mensaje de Postgres</w:t>
-      </w:r>
-    </w:p>
-    <w:p>
-      <w:pPr>
-        <w:pStyle w:val="ListParagraph"/>
-        <w:numPr>
-          <w:ilvl w:val="0"/>
-          <w:numId w:val="2"/>
-        </w:numPr>
-        <w:spacing w:after="80" w:line="276"/>
-      </w:pPr>
-      <w:r>
-        <w:rPr>
-          <w:rFonts w:ascii="Google Sans" w:cs="Google Sans" w:eastAsia="Google Sans" w:hAnsi="Google Sans"/>
-          <w:color w:val="1F1F1F"/>
-          <w:sz w:val="21"/>
-          <w:szCs w:val="21"/>
-        </w:rPr>
-        <w:t xml:space="preserve">S2-15: posible bug: services/userService.js:89 guarda el correo tal como llega, pero services/authService.js:112 busca con el UPN de Microsoft en minúsculas; un usuario creado como "Sara@Empresa.com" no se encuentra y se le crea una segunda cuenta como aprendiz</w:t>
       </w:r>
     </w:p>
     <w:p>

</xml_diff>